<commit_message>
TOC fix: YouTube Channel REV21 - sources entry pointed at the AdSense glossary item; added Find the page you need
</commit_message>
<xml_diff>
--- a/Your First YouTube Channel That Rocks/Your_First_YouTube_Channel_REV21_sources.docx
+++ b/Your First YouTube Channel That Rocks/Your_First_YouTube_Channel_REV21_sources.docx
@@ -250,27 +250,14 @@
       <w:pPr>
         <w:spacing w:after="60" w:line="240" w:lineRule="auto"/>
       </w:pPr>
-      <w:hyperlink w:anchor="toc0">
+      <w:hyperlink w:anchor="_TocAll0002">
         <w:r>
           <w:rPr>
             <w:color w:val="0563C1"/>
             <w:sz w:val="22"/>
             <w:u w:val="single"/>
           </w:rPr>
-          <w:t>Start here</w:t>
-        </w:r>
-      </w:hyperlink>
-    </w:p>
-    <w:p>
-      <w:pPr>
-        <w:spacing w:before="160" w:after="60"/>
-      </w:pPr>
-      <w:hyperlink w:anchor="rev13PartI">
-        <w:r>
-          <w:rPr>
-            <w:b/>
-          </w:rPr>
-          <w:t>Part I Build the Channel</w:t>
+          <w:t xml:space="preserve">Find the page you need</w:t>
         </w:r>
       </w:hyperlink>
     </w:p>
@@ -278,14 +265,27 @@
       <w:pPr>
         <w:spacing w:after="60" w:line="240" w:lineRule="auto"/>
       </w:pPr>
-      <w:hyperlink w:anchor="toc6">
+      <w:hyperlink w:anchor="toc0">
         <w:r>
           <w:rPr>
             <w:color w:val="0563C1"/>
             <w:sz w:val="22"/>
             <w:u w:val="single"/>
           </w:rPr>
-          <w:t>Start this week</w:t>
+          <w:t>Start here</w:t>
+        </w:r>
+      </w:hyperlink>
+    </w:p>
+    <w:p>
+      <w:pPr>
+        <w:spacing w:before="160" w:after="60"/>
+      </w:pPr>
+      <w:hyperlink w:anchor="rev13PartI">
+        <w:r>
+          <w:rPr>
+            <w:b/>
+          </w:rPr>
+          <w:t>Part I Build the Channel</w:t>
         </w:r>
       </w:hyperlink>
     </w:p>
@@ -293,14 +293,14 @@
       <w:pPr>
         <w:spacing w:after="60" w:line="240" w:lineRule="auto"/>
       </w:pPr>
-      <w:hyperlink w:anchor="toc7">
+      <w:hyperlink w:anchor="toc6">
         <w:r>
           <w:rPr>
             <w:color w:val="0563C1"/>
             <w:sz w:val="22"/>
             <w:u w:val="single"/>
           </w:rPr>
-          <w:t>1 Name the Viewer</w:t>
+          <w:t>Start this week</w:t>
         </w:r>
       </w:hyperlink>
     </w:p>
@@ -308,14 +308,14 @@
       <w:pPr>
         <w:spacing w:after="60" w:line="240" w:lineRule="auto"/>
       </w:pPr>
-      <w:hyperlink w:anchor="toc14">
+      <w:hyperlink w:anchor="toc7">
         <w:r>
           <w:rPr>
             <w:color w:val="0563C1"/>
             <w:sz w:val="22"/>
             <w:u w:val="single"/>
           </w:rPr>
-          <w:t>2 The Click Is the Whole Business</w:t>
+          <w:t>1 Name the Viewer</w:t>
         </w:r>
       </w:hyperlink>
     </w:p>
@@ -323,14 +323,14 @@
       <w:pPr>
         <w:spacing w:after="60" w:line="240" w:lineRule="auto"/>
       </w:pPr>
-      <w:hyperlink w:anchor="toc22">
+      <w:hyperlink w:anchor="toc14">
         <w:r>
           <w:rPr>
             <w:color w:val="0563C1"/>
             <w:sz w:val="22"/>
             <w:u w:val="single"/>
           </w:rPr>
-          <w:t>3 Nobody Can Tell What It Cost</w:t>
+          <w:t>2 The Click Is the Whole Business</w:t>
         </w:r>
       </w:hyperlink>
     </w:p>
@@ -338,14 +338,14 @@
       <w:pPr>
         <w:spacing w:after="60" w:line="240" w:lineRule="auto"/>
       </w:pPr>
-      <w:hyperlink w:anchor="toc32">
+      <w:hyperlink w:anchor="toc22">
         <w:r>
           <w:rPr>
             <w:color w:val="0563C1"/>
             <w:sz w:val="22"/>
             <w:u w:val="single"/>
           </w:rPr>
-          <w:t>4 Record It So They Stay</w:t>
+          <w:t>3 Nobody Can Tell What It Cost</w:t>
         </w:r>
       </w:hyperlink>
     </w:p>
@@ -353,14 +353,14 @@
       <w:pPr>
         <w:spacing w:after="60" w:line="240" w:lineRule="auto"/>
       </w:pPr>
-      <w:hyperlink w:anchor="toc41">
+      <w:hyperlink w:anchor="toc32">
         <w:r>
           <w:rPr>
             <w:color w:val="0563C1"/>
             <w:sz w:val="22"/>
             <w:u w:val="single"/>
           </w:rPr>
-          <w:t>5 Eight Videos, Each With One Job</w:t>
+          <w:t>4 Record It So They Stay</w:t>
         </w:r>
       </w:hyperlink>
     </w:p>
@@ -368,14 +368,14 @@
       <w:pPr>
         <w:spacing w:after="60" w:line="240" w:lineRule="auto"/>
       </w:pPr>
-      <w:hyperlink w:anchor="toc48">
+      <w:hyperlink w:anchor="toc41">
         <w:r>
           <w:rPr>
             <w:color w:val="0563C1"/>
             <w:sz w:val="22"/>
             <w:u w:val="single"/>
           </w:rPr>
-          <w:t>6 Six Weeks to a Working Channel</w:t>
+          <w:t>5 Eight Videos, Each With One Job</w:t>
         </w:r>
       </w:hyperlink>
     </w:p>
@@ -383,14 +383,14 @@
       <w:pPr>
         <w:spacing w:after="60" w:line="240" w:lineRule="auto"/>
       </w:pPr>
-      <w:hyperlink w:anchor="toc55">
+      <w:hyperlink w:anchor="toc48">
         <w:r>
           <w:rPr>
             <w:color w:val="0563C1"/>
             <w:sz w:val="22"/>
             <w:u w:val="single"/>
           </w:rPr>
-          <w:t>7 Read the Count</w:t>
+          <w:t>6 Six Weeks to a Working Channel</w:t>
         </w:r>
       </w:hyperlink>
     </w:p>
@@ -398,27 +398,14 @@
       <w:pPr>
         <w:spacing w:after="60" w:line="240" w:lineRule="auto"/>
       </w:pPr>
-      <w:hyperlink w:anchor="toc63">
+      <w:hyperlink w:anchor="toc55">
         <w:r>
           <w:rPr>
             <w:color w:val="0563C1"/>
             <w:sz w:val="22"/>
             <w:u w:val="single"/>
           </w:rPr>
-          <w:t>8 Grow Toward the Gate</w:t>
-        </w:r>
-      </w:hyperlink>
-    </w:p>
-    <w:p>
-      <w:pPr>
-        <w:spacing w:before="160" w:after="60"/>
-      </w:pPr>
-      <w:hyperlink w:anchor="rev13PartII">
-        <w:r>
-          <w:rPr>
-            <w:b/>
-          </w:rPr>
-          <w:t>Part II When Money and Rules Matter</w:t>
+          <w:t>7 Read the Count</w:t>
         </w:r>
       </w:hyperlink>
     </w:p>
@@ -426,14 +413,27 @@
       <w:pPr>
         <w:spacing w:after="60" w:line="240" w:lineRule="auto"/>
       </w:pPr>
-      <w:hyperlink w:anchor="toc72">
+      <w:hyperlink w:anchor="toc63">
         <w:r>
           <w:rPr>
             <w:color w:val="0563C1"/>
             <w:sz w:val="22"/>
             <w:u w:val="single"/>
           </w:rPr>
-          <w:t>9 The Gates and the Review</w:t>
+          <w:t>8 Grow Toward the Gate</w:t>
+        </w:r>
+      </w:hyperlink>
+    </w:p>
+    <w:p>
+      <w:pPr>
+        <w:spacing w:before="160" w:after="60"/>
+      </w:pPr>
+      <w:hyperlink w:anchor="rev13PartII">
+        <w:r>
+          <w:rPr>
+            <w:b/>
+          </w:rPr>
+          <w:t>Part II When Money and Rules Matter</w:t>
         </w:r>
       </w:hyperlink>
     </w:p>
@@ -441,14 +441,14 @@
       <w:pPr>
         <w:spacing w:after="60" w:line="240" w:lineRule="auto"/>
       </w:pPr>
-      <w:hyperlink w:anchor="toc81">
+      <w:hyperlink w:anchor="toc72">
         <w:r>
           <w:rPr>
             <w:color w:val="0563C1"/>
             <w:sz w:val="22"/>
             <w:u w:val="single"/>
           </w:rPr>
-          <w:t>10 The Rules That Can Switch Off the Money</w:t>
+          <w:t>9 The Gates and the Review</w:t>
         </w:r>
       </w:hyperlink>
     </w:p>
@@ -456,14 +456,14 @@
       <w:pPr>
         <w:spacing w:after="60" w:line="240" w:lineRule="auto"/>
       </w:pPr>
-      <w:hyperlink w:anchor="toc94">
+      <w:hyperlink w:anchor="toc81">
         <w:r>
           <w:rPr>
             <w:color w:val="0563C1"/>
             <w:sz w:val="22"/>
             <w:u w:val="single"/>
           </w:rPr>
-          <w:t>11 Ads, RPM, and the Shorts Pool</w:t>
+          <w:t>10 The Rules That Can Switch Off the Money</w:t>
         </w:r>
       </w:hyperlink>
     </w:p>
@@ -471,14 +471,14 @@
       <w:pPr>
         <w:spacing w:after="60" w:line="240" w:lineRule="auto"/>
       </w:pPr>
-      <w:hyperlink w:anchor="toc102">
+      <w:hyperlink w:anchor="toc94">
         <w:r>
           <w:rPr>
             <w:color w:val="0563C1"/>
             <w:sz w:val="22"/>
             <w:u w:val="single"/>
           </w:rPr>
-          <w:t>12 Money From the People Who Watch</w:t>
+          <w:t>11 Ads, RPM, and the Shorts Pool</w:t>
         </w:r>
       </w:hyperlink>
     </w:p>
@@ -486,14 +486,14 @@
       <w:pPr>
         <w:spacing w:after="60" w:line="240" w:lineRule="auto"/>
       </w:pPr>
-      <w:hyperlink w:anchor="toc109">
+      <w:hyperlink w:anchor="toc102">
         <w:r>
           <w:rPr>
             <w:color w:val="0563C1"/>
             <w:sz w:val="22"/>
             <w:u w:val="single"/>
           </w:rPr>
-          <w:t>13 Sponsors and Affiliate Links</w:t>
+          <w:t>12 Money From the People Who Watch</w:t>
         </w:r>
       </w:hyperlink>
     </w:p>
@@ -501,27 +501,14 @@
       <w:pPr>
         <w:spacing w:after="60" w:line="240" w:lineRule="auto"/>
       </w:pPr>
-      <w:hyperlink w:anchor="toc118">
+      <w:hyperlink w:anchor="toc109">
         <w:r>
           <w:rPr>
             <w:color w:val="0563C1"/>
             <w:sz w:val="22"/>
             <w:u w:val="single"/>
           </w:rPr>
-          <w:t>14 Keep It Paying</w:t>
-        </w:r>
-      </w:hyperlink>
-    </w:p>
-    <w:p>
-      <w:pPr>
-        <w:spacing w:before="160" w:after="60"/>
-      </w:pPr>
-      <w:hyperlink w:anchor="rev13PartIII">
-        <w:r>
-          <w:rPr>
-            <w:b/>
-          </w:rPr>
-          <w:t>Part III Workbook</w:t>
+          <w:t>13 Sponsors and Affiliate Links</w:t>
         </w:r>
       </w:hyperlink>
     </w:p>
@@ -529,14 +516,27 @@
       <w:pPr>
         <w:spacing w:after="60" w:line="240" w:lineRule="auto"/>
       </w:pPr>
-      <w:hyperlink w:anchor="toc127">
+      <w:hyperlink w:anchor="toc118">
         <w:r>
           <w:rPr>
             <w:color w:val="0563C1"/>
             <w:sz w:val="22"/>
             <w:u w:val="single"/>
           </w:rPr>
-          <w:t>15 The Channel Workbook</w:t>
+          <w:t>14 Keep It Paying</w:t>
+        </w:r>
+      </w:hyperlink>
+    </w:p>
+    <w:p>
+      <w:pPr>
+        <w:spacing w:before="160" w:after="60"/>
+      </w:pPr>
+      <w:hyperlink w:anchor="rev13PartIII">
+        <w:r>
+          <w:rPr>
+            <w:b/>
+          </w:rPr>
+          <w:t>Part III Workbook</w:t>
         </w:r>
       </w:hyperlink>
     </w:p>
@@ -544,14 +544,14 @@
       <w:pPr>
         <w:spacing w:after="60" w:line="240" w:lineRule="auto"/>
       </w:pPr>
-      <w:hyperlink w:anchor="toc138">
+      <w:hyperlink w:anchor="toc127">
         <w:r>
           <w:rPr>
             <w:color w:val="0563C1"/>
             <w:sz w:val="22"/>
             <w:u w:val="single"/>
           </w:rPr>
-          <w:t>The last word</w:t>
+          <w:t>15 The Channel Workbook</w:t>
         </w:r>
       </w:hyperlink>
     </w:p>
@@ -559,14 +559,14 @@
       <w:pPr>
         <w:spacing w:after="60" w:line="240" w:lineRule="auto"/>
       </w:pPr>
-      <w:hyperlink w:anchor="toc139">
+      <w:hyperlink w:anchor="toc138">
         <w:r>
           <w:rPr>
             <w:color w:val="0563C1"/>
             <w:sz w:val="22"/>
             <w:u w:val="single"/>
           </w:rPr>
-          <w:t>Glossary</w:t>
+          <w:t>The last word</w:t>
         </w:r>
       </w:hyperlink>
     </w:p>
@@ -574,14 +574,14 @@
       <w:pPr>
         <w:spacing w:after="60" w:line="240" w:lineRule="auto"/>
       </w:pPr>
-      <w:hyperlink w:anchor="toc140">
+      <w:hyperlink w:anchor="toc139">
         <w:r>
           <w:rPr>
             <w:color w:val="0563C1"/>
             <w:sz w:val="22"/>
             <w:u w:val="single"/>
           </w:rPr>
-          <w:t>Official sources and updates</w:t>
+          <w:t>Glossary</w:t>
         </w:r>
       </w:hyperlink>
     </w:p>
@@ -589,13 +589,28 @@
       <w:pPr>
         <w:spacing w:after="60" w:line="240" w:lineRule="auto"/>
       </w:pPr>
-      <w:hyperlink w:anchor="toc141">
+      <w:hyperlink w:anchor="_TocAll0001">
         <w:r>
           <w:rPr>
             <w:color w:val="0563C1"/>
             <w:sz w:val="22"/>
             <w:u w:val="single"/>
           </w:rPr>
+          <w:t>Official sources and updates</w:t>
+        </w:r>
+      </w:hyperlink>
+    </w:p>
+    <w:p>
+      <w:pPr>
+        <w:spacing w:after="60" w:line="240" w:lineRule="auto"/>
+      </w:pPr>
+      <w:hyperlink w:anchor="toc141">
+        <w:r>
+          <w:rPr>
+            <w:color w:val="0563C1"/>
+            <w:sz w:val="22"/>
+            <w:u w:val="single"/>
+          </w:rPr>
           <w:t>Also by Kevin Drew Peters</w:t>
         </w:r>
       </w:hyperlink>
@@ -605,6 +620,8 @@
         <w:pStyle w:val="Heading1"/>
         <w:pageBreakBefore/>
       </w:pPr>
+      <w:bookmarkStart w:id="252" w:name="_TocAll0002"/>
+      <w:bookmarkEnd w:id="252"/>
       <w:r>
         <w:lastRenderedPageBreak/>
         <w:t>Find the page you need</w:t>
@@ -16855,6 +16872,8 @@
         <w:pStyle w:val="Heading1"/>
         <w:pageBreakBefore/>
       </w:pPr>
+      <w:bookmarkStart w:id="251" w:name="_TocAll0001"/>
+      <w:bookmarkEnd w:id="251"/>
       <w:r>
         <w:lastRenderedPageBreak/>
         <w:t>Official sources and updates</w:t>

</xml_diff>

<commit_message>
TOC fix: YouTube Channel REV21 - sources entry pointed at the AdSense glossary item; added Find the page you need [merged onto main from book-2-lectures-after-qed b4eb829, paths only]
</commit_message>
<xml_diff>
--- a/Your First YouTube Channel That Rocks/Your_First_YouTube_Channel_REV21_sources.docx
+++ b/Your First YouTube Channel That Rocks/Your_First_YouTube_Channel_REV21_sources.docx
@@ -250,27 +250,14 @@
       <w:pPr>
         <w:spacing w:after="60" w:line="240" w:lineRule="auto"/>
       </w:pPr>
-      <w:hyperlink w:anchor="toc0">
+      <w:hyperlink w:anchor="_TocAll0002">
         <w:r>
           <w:rPr>
             <w:color w:val="0563C1"/>
             <w:sz w:val="22"/>
             <w:u w:val="single"/>
           </w:rPr>
-          <w:t>Start here</w:t>
-        </w:r>
-      </w:hyperlink>
-    </w:p>
-    <w:p>
-      <w:pPr>
-        <w:spacing w:before="160" w:after="60"/>
-      </w:pPr>
-      <w:hyperlink w:anchor="rev13PartI">
-        <w:r>
-          <w:rPr>
-            <w:b/>
-          </w:rPr>
-          <w:t>Part I Build the Channel</w:t>
+          <w:t xml:space="preserve">Find the page you need</w:t>
         </w:r>
       </w:hyperlink>
     </w:p>
@@ -278,14 +265,27 @@
       <w:pPr>
         <w:spacing w:after="60" w:line="240" w:lineRule="auto"/>
       </w:pPr>
-      <w:hyperlink w:anchor="toc6">
+      <w:hyperlink w:anchor="toc0">
         <w:r>
           <w:rPr>
             <w:color w:val="0563C1"/>
             <w:sz w:val="22"/>
             <w:u w:val="single"/>
           </w:rPr>
-          <w:t>Start this week</w:t>
+          <w:t>Start here</w:t>
+        </w:r>
+      </w:hyperlink>
+    </w:p>
+    <w:p>
+      <w:pPr>
+        <w:spacing w:before="160" w:after="60"/>
+      </w:pPr>
+      <w:hyperlink w:anchor="rev13PartI">
+        <w:r>
+          <w:rPr>
+            <w:b/>
+          </w:rPr>
+          <w:t>Part I Build the Channel</w:t>
         </w:r>
       </w:hyperlink>
     </w:p>
@@ -293,14 +293,14 @@
       <w:pPr>
         <w:spacing w:after="60" w:line="240" w:lineRule="auto"/>
       </w:pPr>
-      <w:hyperlink w:anchor="toc7">
+      <w:hyperlink w:anchor="toc6">
         <w:r>
           <w:rPr>
             <w:color w:val="0563C1"/>
             <w:sz w:val="22"/>
             <w:u w:val="single"/>
           </w:rPr>
-          <w:t>1 Name the Viewer</w:t>
+          <w:t>Start this week</w:t>
         </w:r>
       </w:hyperlink>
     </w:p>
@@ -308,14 +308,14 @@
       <w:pPr>
         <w:spacing w:after="60" w:line="240" w:lineRule="auto"/>
       </w:pPr>
-      <w:hyperlink w:anchor="toc14">
+      <w:hyperlink w:anchor="toc7">
         <w:r>
           <w:rPr>
             <w:color w:val="0563C1"/>
             <w:sz w:val="22"/>
             <w:u w:val="single"/>
           </w:rPr>
-          <w:t>2 The Click Is the Whole Business</w:t>
+          <w:t>1 Name the Viewer</w:t>
         </w:r>
       </w:hyperlink>
     </w:p>
@@ -323,14 +323,14 @@
       <w:pPr>
         <w:spacing w:after="60" w:line="240" w:lineRule="auto"/>
       </w:pPr>
-      <w:hyperlink w:anchor="toc22">
+      <w:hyperlink w:anchor="toc14">
         <w:r>
           <w:rPr>
             <w:color w:val="0563C1"/>
             <w:sz w:val="22"/>
             <w:u w:val="single"/>
           </w:rPr>
-          <w:t>3 Nobody Can Tell What It Cost</w:t>
+          <w:t>2 The Click Is the Whole Business</w:t>
         </w:r>
       </w:hyperlink>
     </w:p>
@@ -338,14 +338,14 @@
       <w:pPr>
         <w:spacing w:after="60" w:line="240" w:lineRule="auto"/>
       </w:pPr>
-      <w:hyperlink w:anchor="toc32">
+      <w:hyperlink w:anchor="toc22">
         <w:r>
           <w:rPr>
             <w:color w:val="0563C1"/>
             <w:sz w:val="22"/>
             <w:u w:val="single"/>
           </w:rPr>
-          <w:t>4 Record It So They Stay</w:t>
+          <w:t>3 Nobody Can Tell What It Cost</w:t>
         </w:r>
       </w:hyperlink>
     </w:p>
@@ -353,14 +353,14 @@
       <w:pPr>
         <w:spacing w:after="60" w:line="240" w:lineRule="auto"/>
       </w:pPr>
-      <w:hyperlink w:anchor="toc41">
+      <w:hyperlink w:anchor="toc32">
         <w:r>
           <w:rPr>
             <w:color w:val="0563C1"/>
             <w:sz w:val="22"/>
             <w:u w:val="single"/>
           </w:rPr>
-          <w:t>5 Eight Videos, Each With One Job</w:t>
+          <w:t>4 Record It So They Stay</w:t>
         </w:r>
       </w:hyperlink>
     </w:p>
@@ -368,14 +368,14 @@
       <w:pPr>
         <w:spacing w:after="60" w:line="240" w:lineRule="auto"/>
       </w:pPr>
-      <w:hyperlink w:anchor="toc48">
+      <w:hyperlink w:anchor="toc41">
         <w:r>
           <w:rPr>
             <w:color w:val="0563C1"/>
             <w:sz w:val="22"/>
             <w:u w:val="single"/>
           </w:rPr>
-          <w:t>6 Six Weeks to a Working Channel</w:t>
+          <w:t>5 Eight Videos, Each With One Job</w:t>
         </w:r>
       </w:hyperlink>
     </w:p>
@@ -383,14 +383,14 @@
       <w:pPr>
         <w:spacing w:after="60" w:line="240" w:lineRule="auto"/>
       </w:pPr>
-      <w:hyperlink w:anchor="toc55">
+      <w:hyperlink w:anchor="toc48">
         <w:r>
           <w:rPr>
             <w:color w:val="0563C1"/>
             <w:sz w:val="22"/>
             <w:u w:val="single"/>
           </w:rPr>
-          <w:t>7 Read the Count</w:t>
+          <w:t>6 Six Weeks to a Working Channel</w:t>
         </w:r>
       </w:hyperlink>
     </w:p>
@@ -398,27 +398,14 @@
       <w:pPr>
         <w:spacing w:after="60" w:line="240" w:lineRule="auto"/>
       </w:pPr>
-      <w:hyperlink w:anchor="toc63">
+      <w:hyperlink w:anchor="toc55">
         <w:r>
           <w:rPr>
             <w:color w:val="0563C1"/>
             <w:sz w:val="22"/>
             <w:u w:val="single"/>
           </w:rPr>
-          <w:t>8 Grow Toward the Gate</w:t>
-        </w:r>
-      </w:hyperlink>
-    </w:p>
-    <w:p>
-      <w:pPr>
-        <w:spacing w:before="160" w:after="60"/>
-      </w:pPr>
-      <w:hyperlink w:anchor="rev13PartII">
-        <w:r>
-          <w:rPr>
-            <w:b/>
-          </w:rPr>
-          <w:t>Part II When Money and Rules Matter</w:t>
+          <w:t>7 Read the Count</w:t>
         </w:r>
       </w:hyperlink>
     </w:p>
@@ -426,14 +413,27 @@
       <w:pPr>
         <w:spacing w:after="60" w:line="240" w:lineRule="auto"/>
       </w:pPr>
-      <w:hyperlink w:anchor="toc72">
+      <w:hyperlink w:anchor="toc63">
         <w:r>
           <w:rPr>
             <w:color w:val="0563C1"/>
             <w:sz w:val="22"/>
             <w:u w:val="single"/>
           </w:rPr>
-          <w:t>9 The Gates and the Review</w:t>
+          <w:t>8 Grow Toward the Gate</w:t>
+        </w:r>
+      </w:hyperlink>
+    </w:p>
+    <w:p>
+      <w:pPr>
+        <w:spacing w:before="160" w:after="60"/>
+      </w:pPr>
+      <w:hyperlink w:anchor="rev13PartII">
+        <w:r>
+          <w:rPr>
+            <w:b/>
+          </w:rPr>
+          <w:t>Part II When Money and Rules Matter</w:t>
         </w:r>
       </w:hyperlink>
     </w:p>
@@ -441,14 +441,14 @@
       <w:pPr>
         <w:spacing w:after="60" w:line="240" w:lineRule="auto"/>
       </w:pPr>
-      <w:hyperlink w:anchor="toc81">
+      <w:hyperlink w:anchor="toc72">
         <w:r>
           <w:rPr>
             <w:color w:val="0563C1"/>
             <w:sz w:val="22"/>
             <w:u w:val="single"/>
           </w:rPr>
-          <w:t>10 The Rules That Can Switch Off the Money</w:t>
+          <w:t>9 The Gates and the Review</w:t>
         </w:r>
       </w:hyperlink>
     </w:p>
@@ -456,14 +456,14 @@
       <w:pPr>
         <w:spacing w:after="60" w:line="240" w:lineRule="auto"/>
       </w:pPr>
-      <w:hyperlink w:anchor="toc94">
+      <w:hyperlink w:anchor="toc81">
         <w:r>
           <w:rPr>
             <w:color w:val="0563C1"/>
             <w:sz w:val="22"/>
             <w:u w:val="single"/>
           </w:rPr>
-          <w:t>11 Ads, RPM, and the Shorts Pool</w:t>
+          <w:t>10 The Rules That Can Switch Off the Money</w:t>
         </w:r>
       </w:hyperlink>
     </w:p>
@@ -471,14 +471,14 @@
       <w:pPr>
         <w:spacing w:after="60" w:line="240" w:lineRule="auto"/>
       </w:pPr>
-      <w:hyperlink w:anchor="toc102">
+      <w:hyperlink w:anchor="toc94">
         <w:r>
           <w:rPr>
             <w:color w:val="0563C1"/>
             <w:sz w:val="22"/>
             <w:u w:val="single"/>
           </w:rPr>
-          <w:t>12 Money From the People Who Watch</w:t>
+          <w:t>11 Ads, RPM, and the Shorts Pool</w:t>
         </w:r>
       </w:hyperlink>
     </w:p>
@@ -486,14 +486,14 @@
       <w:pPr>
         <w:spacing w:after="60" w:line="240" w:lineRule="auto"/>
       </w:pPr>
-      <w:hyperlink w:anchor="toc109">
+      <w:hyperlink w:anchor="toc102">
         <w:r>
           <w:rPr>
             <w:color w:val="0563C1"/>
             <w:sz w:val="22"/>
             <w:u w:val="single"/>
           </w:rPr>
-          <w:t>13 Sponsors and Affiliate Links</w:t>
+          <w:t>12 Money From the People Who Watch</w:t>
         </w:r>
       </w:hyperlink>
     </w:p>
@@ -501,27 +501,14 @@
       <w:pPr>
         <w:spacing w:after="60" w:line="240" w:lineRule="auto"/>
       </w:pPr>
-      <w:hyperlink w:anchor="toc118">
+      <w:hyperlink w:anchor="toc109">
         <w:r>
           <w:rPr>
             <w:color w:val="0563C1"/>
             <w:sz w:val="22"/>
             <w:u w:val="single"/>
           </w:rPr>
-          <w:t>14 Keep It Paying</w:t>
-        </w:r>
-      </w:hyperlink>
-    </w:p>
-    <w:p>
-      <w:pPr>
-        <w:spacing w:before="160" w:after="60"/>
-      </w:pPr>
-      <w:hyperlink w:anchor="rev13PartIII">
-        <w:r>
-          <w:rPr>
-            <w:b/>
-          </w:rPr>
-          <w:t>Part III Workbook</w:t>
+          <w:t>13 Sponsors and Affiliate Links</w:t>
         </w:r>
       </w:hyperlink>
     </w:p>
@@ -529,14 +516,27 @@
       <w:pPr>
         <w:spacing w:after="60" w:line="240" w:lineRule="auto"/>
       </w:pPr>
-      <w:hyperlink w:anchor="toc127">
+      <w:hyperlink w:anchor="toc118">
         <w:r>
           <w:rPr>
             <w:color w:val="0563C1"/>
             <w:sz w:val="22"/>
             <w:u w:val="single"/>
           </w:rPr>
-          <w:t>15 The Channel Workbook</w:t>
+          <w:t>14 Keep It Paying</w:t>
+        </w:r>
+      </w:hyperlink>
+    </w:p>
+    <w:p>
+      <w:pPr>
+        <w:spacing w:before="160" w:after="60"/>
+      </w:pPr>
+      <w:hyperlink w:anchor="rev13PartIII">
+        <w:r>
+          <w:rPr>
+            <w:b/>
+          </w:rPr>
+          <w:t>Part III Workbook</w:t>
         </w:r>
       </w:hyperlink>
     </w:p>
@@ -544,14 +544,14 @@
       <w:pPr>
         <w:spacing w:after="60" w:line="240" w:lineRule="auto"/>
       </w:pPr>
-      <w:hyperlink w:anchor="toc138">
+      <w:hyperlink w:anchor="toc127">
         <w:r>
           <w:rPr>
             <w:color w:val="0563C1"/>
             <w:sz w:val="22"/>
             <w:u w:val="single"/>
           </w:rPr>
-          <w:t>The last word</w:t>
+          <w:t>15 The Channel Workbook</w:t>
         </w:r>
       </w:hyperlink>
     </w:p>
@@ -559,14 +559,14 @@
       <w:pPr>
         <w:spacing w:after="60" w:line="240" w:lineRule="auto"/>
       </w:pPr>
-      <w:hyperlink w:anchor="toc139">
+      <w:hyperlink w:anchor="toc138">
         <w:r>
           <w:rPr>
             <w:color w:val="0563C1"/>
             <w:sz w:val="22"/>
             <w:u w:val="single"/>
           </w:rPr>
-          <w:t>Glossary</w:t>
+          <w:t>The last word</w:t>
         </w:r>
       </w:hyperlink>
     </w:p>
@@ -574,14 +574,14 @@
       <w:pPr>
         <w:spacing w:after="60" w:line="240" w:lineRule="auto"/>
       </w:pPr>
-      <w:hyperlink w:anchor="toc140">
+      <w:hyperlink w:anchor="toc139">
         <w:r>
           <w:rPr>
             <w:color w:val="0563C1"/>
             <w:sz w:val="22"/>
             <w:u w:val="single"/>
           </w:rPr>
-          <w:t>Official sources and updates</w:t>
+          <w:t>Glossary</w:t>
         </w:r>
       </w:hyperlink>
     </w:p>
@@ -589,13 +589,28 @@
       <w:pPr>
         <w:spacing w:after="60" w:line="240" w:lineRule="auto"/>
       </w:pPr>
-      <w:hyperlink w:anchor="toc141">
+      <w:hyperlink w:anchor="_TocAll0001">
         <w:r>
           <w:rPr>
             <w:color w:val="0563C1"/>
             <w:sz w:val="22"/>
             <w:u w:val="single"/>
           </w:rPr>
+          <w:t>Official sources and updates</w:t>
+        </w:r>
+      </w:hyperlink>
+    </w:p>
+    <w:p>
+      <w:pPr>
+        <w:spacing w:after="60" w:line="240" w:lineRule="auto"/>
+      </w:pPr>
+      <w:hyperlink w:anchor="toc141">
+        <w:r>
+          <w:rPr>
+            <w:color w:val="0563C1"/>
+            <w:sz w:val="22"/>
+            <w:u w:val="single"/>
+          </w:rPr>
           <w:t>Also by Kevin Drew Peters</w:t>
         </w:r>
       </w:hyperlink>
@@ -605,6 +620,8 @@
         <w:pStyle w:val="Heading1"/>
         <w:pageBreakBefore/>
       </w:pPr>
+      <w:bookmarkStart w:id="252" w:name="_TocAll0002"/>
+      <w:bookmarkEnd w:id="252"/>
       <w:r>
         <w:lastRenderedPageBreak/>
         <w:t>Find the page you need</w:t>
@@ -16855,6 +16872,8 @@
         <w:pStyle w:val="Heading1"/>
         <w:pageBreakBefore/>
       </w:pPr>
+      <w:bookmarkStart w:id="251" w:name="_TocAll0001"/>
+      <w:bookmarkEnd w:id="251"/>
       <w:r>
         <w:lastRenderedPageBreak/>
         <w:t>Official sources and updates</w:t>

</xml_diff>